<commit_message>
feat: preview usa plantillas Word reales via mammoth - elimina HTML artesanal
</commit_message>
<xml_diff>
--- a/public/plantillas/A3 - Citación (víctima, testigo, perito, depositario u otro) - Carpeta Fiscal.docx
+++ b/public/plantillas/A3 - Citación (víctima, testigo, perito, depositario u otro) - Carpeta Fiscal.docx
@@ -77,7 +77,15 @@
           <w:sz w:val="24"/>
           <w:szCs w:val="24"/>
         </w:rPr>
-        <w:t>Sr. (a): </w:t>
+        <w:t>Sr. (a):{nombre}</w:t>
+      </w:r>
+      <w:r>
+        <w:rPr>
+          <w:rFonts w:ascii="Arial" w:hAnsi="Arial" w:cs="Arial"/>
+          <w:sz w:val="24"/>
+          <w:szCs w:val="24"/>
+        </w:rPr>
+        <w:t xml:space="preserve">, identificado con DNI N° </w:t>
       </w:r>
       <w:r>
         <w:rPr>
@@ -87,15 +95,15 @@
           <w:sz w:val="24"/>
           <w:szCs w:val="24"/>
         </w:rPr>
-        <w:t>{nombre}</w:t>
-      </w:r>
-      <w:r>
-        <w:rPr>
-          <w:rFonts w:ascii="Arial" w:hAnsi="Arial" w:cs="Arial"/>
-          <w:sz w:val="24"/>
-          <w:szCs w:val="24"/>
-        </w:rPr>
-        <w:t xml:space="preserve">, identificado con DNI N° </w:t>
+        <w:t>{dni}</w:t>
+      </w:r>
+      <w:r>
+        <w:rPr>
+          <w:rFonts w:ascii="Arial" w:hAnsi="Arial" w:cs="Arial"/>
+          <w:sz w:val="24"/>
+          <w:szCs w:val="24"/>
+        </w:rPr>
+        <w:t xml:space="preserve">, domiciliado en {domicilio}, distrito {distrito}, provincia {provincia} y departamento {departamento}, con celular N° {celular} y correo electrónico {email}; mediante la presente, se le </w:t>
       </w:r>
       <w:r>
         <w:rPr>
@@ -105,111 +113,15 @@
           <w:sz w:val="24"/>
           <w:szCs w:val="24"/>
         </w:rPr>
-        <w:t>{dni}</w:t>
-      </w:r>
-      <w:r>
-        <w:rPr>
-          <w:rFonts w:ascii="Arial" w:hAnsi="Arial" w:cs="Arial"/>
-          <w:sz w:val="24"/>
-          <w:szCs w:val="24"/>
-        </w:rPr>
-        <w:t xml:space="preserve">, domiciliado en </w:t>
-      </w:r>
-      <w:r>
-        <w:rPr>
-          <w:rFonts w:ascii="Arial" w:hAnsi="Arial" w:cs="Arial"/>
-          <w:sz w:val="24"/>
-          <w:szCs w:val="24"/>
-        </w:rPr>
-        <w:t>{domicilio}</w:t>
-      </w:r>
-      <w:r>
-        <w:rPr>
-          <w:rFonts w:ascii="Arial" w:hAnsi="Arial" w:cs="Arial"/>
-          <w:sz w:val="24"/>
-          <w:szCs w:val="24"/>
-        </w:rPr>
-        <w:t xml:space="preserve">, distrito </w:t>
-      </w:r>
-      <w:r>
-        <w:rPr>
-          <w:rFonts w:ascii="Arial" w:hAnsi="Arial" w:cs="Arial"/>
-          <w:sz w:val="24"/>
-          <w:szCs w:val="24"/>
-        </w:rPr>
-        <w:t>{distrito}</w:t>
-      </w:r>
-      <w:r>
-        <w:rPr>
-          <w:rFonts w:ascii="Arial" w:hAnsi="Arial" w:cs="Arial"/>
-          <w:sz w:val="24"/>
-          <w:szCs w:val="24"/>
-        </w:rPr>
-        <w:t xml:space="preserve">, provincia </w:t>
-      </w:r>
-      <w:r>
-        <w:rPr>
-          <w:rFonts w:ascii="Arial" w:hAnsi="Arial" w:cs="Arial"/>
-          <w:sz w:val="24"/>
-          <w:szCs w:val="24"/>
-        </w:rPr>
-        <w:t>{provincia}</w:t>
-      </w:r>
-      <w:r>
-        <w:rPr>
-          <w:rFonts w:ascii="Arial" w:hAnsi="Arial" w:cs="Arial"/>
-          <w:sz w:val="24"/>
-          <w:szCs w:val="24"/>
-        </w:rPr>
-        <w:t xml:space="preserve"> y departamento </w:t>
-      </w:r>
-      <w:r>
-        <w:rPr>
-          <w:rFonts w:ascii="Arial" w:hAnsi="Arial" w:cs="Arial"/>
-          <w:sz w:val="24"/>
-          <w:szCs w:val="24"/>
-        </w:rPr>
-        <w:t>{departamento}</w:t>
-      </w:r>
-      <w:r>
-        <w:rPr>
-          <w:rFonts w:ascii="Arial" w:hAnsi="Arial" w:cs="Arial"/>
-          <w:sz w:val="24"/>
-          <w:szCs w:val="24"/>
-        </w:rPr>
-        <w:t xml:space="preserve">, con celular N° </w:t>
-      </w:r>
-      <w:r>
-        <w:rPr>
-          <w:rFonts w:ascii="Arial" w:hAnsi="Arial" w:cs="Arial"/>
-          <w:sz w:val="24"/>
-          <w:szCs w:val="24"/>
-        </w:rPr>
-        <w:t>{celular}</w:t>
-      </w:r>
-      <w:r>
-        <w:rPr>
-          <w:rFonts w:ascii="Arial" w:hAnsi="Arial" w:cs="Arial"/>
-          <w:sz w:val="24"/>
-          <w:szCs w:val="24"/>
-        </w:rPr>
-        <w:t xml:space="preserve"> y correo electrónico </w:t>
-      </w:r>
-      <w:r>
-        <w:rPr>
-          <w:rFonts w:ascii="Arial" w:hAnsi="Arial" w:cs="Arial"/>
-          <w:sz w:val="24"/>
-          <w:szCs w:val="24"/>
-        </w:rPr>
-        <w:t>{email}</w:t>
-      </w:r>
-      <w:r>
-        <w:rPr>
-          <w:rFonts w:ascii="Arial" w:hAnsi="Arial" w:cs="Arial"/>
-          <w:sz w:val="24"/>
-          <w:szCs w:val="24"/>
-        </w:rPr>
-        <w:t xml:space="preserve">; mediante la presente, se le </w:t>
+        <w:t>CITA</w:t>
+      </w:r>
+      <w:r>
+        <w:rPr>
+          <w:rFonts w:ascii="Arial" w:hAnsi="Arial" w:cs="Arial"/>
+          <w:sz w:val="24"/>
+          <w:szCs w:val="24"/>
+        </w:rPr>
+        <w:t xml:space="preserve"> para que concurra, al </w:t>
       </w:r>
       <w:r>
         <w:rPr>
@@ -219,15 +131,15 @@
           <w:sz w:val="24"/>
           <w:szCs w:val="24"/>
         </w:rPr>
-        <w:t>CITA</w:t>
-      </w:r>
-      <w:r>
-        <w:rPr>
-          <w:rFonts w:ascii="Arial" w:hAnsi="Arial" w:cs="Arial"/>
-          <w:sz w:val="24"/>
-          <w:szCs w:val="24"/>
-        </w:rPr>
-        <w:t xml:space="preserve"> para que concurra, al </w:t>
+        <w:t>Departamento Desconcentrado de Investigación Contra la Corrupción de Iquitos</w:t>
+      </w:r>
+      <w:r>
+        <w:rPr>
+          <w:rFonts w:ascii="Arial" w:hAnsi="Arial" w:cs="Arial"/>
+          <w:sz w:val="24"/>
+          <w:szCs w:val="24"/>
+        </w:rPr>
+        <w:t xml:space="preserve">, sito en la </w:t>
       </w:r>
       <w:r>
         <w:rPr>
@@ -237,15 +149,15 @@
           <w:sz w:val="24"/>
           <w:szCs w:val="24"/>
         </w:rPr>
-        <w:t>Departamento Desconcentrado de Investigación Contra la Corrupción de Iquitos</w:t>
-      </w:r>
-      <w:r>
-        <w:rPr>
-          <w:rFonts w:ascii="Arial" w:hAnsi="Arial" w:cs="Arial"/>
-          <w:sz w:val="24"/>
-          <w:szCs w:val="24"/>
-        </w:rPr>
-        <w:t xml:space="preserve">, sito en la </w:t>
+        <w:t>Av. Grau N° 1840 – Iquitos (Ref. frente a la puerta número 2 del Hospital Iquitos)</w:t>
+      </w:r>
+      <w:r>
+        <w:rPr>
+          <w:rFonts w:ascii="Arial" w:hAnsi="Arial" w:cs="Arial"/>
+          <w:sz w:val="24"/>
+          <w:szCs w:val="24"/>
+        </w:rPr>
+        <w:t xml:space="preserve">, con la finalidad de rendir su declaración relacionada con el documento de la referencia, dispuesta por la </w:t>
       </w:r>
       <w:r>
         <w:rPr>
@@ -255,15 +167,15 @@
           <w:sz w:val="24"/>
           <w:szCs w:val="24"/>
         </w:rPr>
-        <w:t>Av. Grau N° 1840 – Iquitos (Ref. frente a la puerta número 2 del Hospital Iquitos)</w:t>
-      </w:r>
-      <w:r>
-        <w:rPr>
-          <w:rFonts w:ascii="Arial" w:hAnsi="Arial" w:cs="Arial"/>
-          <w:sz w:val="24"/>
-          <w:szCs w:val="24"/>
-        </w:rPr>
-        <w:t xml:space="preserve">, con la finalidad de rendir su declaración relacionada con el documento de la referencia, dispuesta por la </w:t>
+        <w:t>Fiscalía Corporativa Especializada en Delitos de Corrupción de Funcionarios de Loreto</w:t>
+      </w:r>
+      <w:r>
+        <w:rPr>
+          <w:rFonts w:ascii="Arial" w:hAnsi="Arial" w:cs="Arial"/>
+          <w:sz w:val="24"/>
+          <w:szCs w:val="24"/>
+        </w:rPr>
+        <w:t xml:space="preserve">, por la presunta comisión del delito </w:t>
       </w:r>
       <w:r>
         <w:rPr>
@@ -273,15 +185,15 @@
           <w:sz w:val="24"/>
           <w:szCs w:val="24"/>
         </w:rPr>
-        <w:t>Fiscalía Corporativa Especializada en Delitos de Corrupción de Funcionarios de Loreto</w:t>
-      </w:r>
-      <w:r>
-        <w:rPr>
-          <w:rFonts w:ascii="Arial" w:hAnsi="Arial" w:cs="Arial"/>
-          <w:sz w:val="24"/>
-          <w:szCs w:val="24"/>
-        </w:rPr>
-        <w:t xml:space="preserve">, por la presunta comisión del delito </w:t>
+        <w:t>Contra la Administración Pública en la modalidad de{modalidadDelito}</w:t>
+      </w:r>
+      <w:r>
+        <w:rPr>
+          <w:rFonts w:ascii="Arial" w:hAnsi="Arial" w:cs="Arial"/>
+          <w:sz w:val="24"/>
+          <w:szCs w:val="24"/>
+        </w:rPr>
+        <w:t xml:space="preserve">, en su condición de </w:t>
       </w:r>
       <w:r>
         <w:rPr>
@@ -291,7 +203,15 @@
           <w:sz w:val="24"/>
           <w:szCs w:val="24"/>
         </w:rPr>
-        <w:t>Contra la Administración Pública en la modalidad de </w:t>
+        <w:t>{condicion}</w:t>
+      </w:r>
+      <w:r>
+        <w:rPr>
+          <w:rFonts w:ascii="Arial" w:hAnsi="Arial" w:cs="Arial"/>
+          <w:sz w:val="24"/>
+          <w:szCs w:val="24"/>
+        </w:rPr>
+        <w:t xml:space="preserve">, seguido en contra de </w:t>
       </w:r>
       <w:r>
         <w:rPr>
@@ -301,15 +221,15 @@
           <w:sz w:val="24"/>
           <w:szCs w:val="24"/>
         </w:rPr>
-        <w:t>{modalidadDelito}</w:t>
-      </w:r>
-      <w:r>
-        <w:rPr>
-          <w:rFonts w:ascii="Arial" w:hAnsi="Arial" w:cs="Arial"/>
-          <w:sz w:val="24"/>
-          <w:szCs w:val="24"/>
-        </w:rPr>
-        <w:t xml:space="preserve">, en su condición de </w:t>
+        <w:t>{imputados}</w:t>
+      </w:r>
+      <w:r>
+        <w:rPr>
+          <w:rFonts w:ascii="Arial" w:hAnsi="Arial" w:cs="Arial"/>
+          <w:sz w:val="24"/>
+          <w:szCs w:val="24"/>
+        </w:rPr>
+        <w:t xml:space="preserve">, en agravio de </w:t>
       </w:r>
       <w:r>
         <w:rPr>
@@ -319,16 +239,44 @@
           <w:sz w:val="24"/>
           <w:szCs w:val="24"/>
         </w:rPr>
-        <w:t>{condicion}</w:t>
-      </w:r>
-      <w:r>
-        <w:rPr>
-          <w:rFonts w:ascii="Arial" w:hAnsi="Arial" w:cs="Arial"/>
-          <w:sz w:val="24"/>
-          <w:szCs w:val="24"/>
-        </w:rPr>
-        <w:t xml:space="preserve">, seguido en contra de </w:t>
-      </w:r>
+        <w:t>{agraviado}</w:t>
+      </w:r>
+      <w:r>
+        <w:rPr>
+          <w:rFonts w:ascii="Arial" w:hAnsi="Arial" w:cs="Arial"/>
+          <w:sz w:val="24"/>
+          <w:szCs w:val="24"/>
+        </w:rPr>
+        <w:t>.</w:t>
+      </w:r>
+    </w:p>
+    <w:p>
+      <w:pPr>
+        <w:spacing w:after="120"/>
+        <w:rPr>
+          <w:rFonts w:ascii="Arial" w:hAnsi="Arial" w:cs="Arial"/>
+          <w:sz w:val="24"/>
+          <w:szCs w:val="24"/>
+        </w:rPr>
+      </w:pPr>
+      <w:r>
+        <w:rPr>
+          <w:rFonts w:ascii="Arial" w:hAnsi="Arial" w:cs="Arial"/>
+          <w:sz w:val="24"/>
+          <w:szCs w:val="24"/>
+        </w:rPr>
+        <w:t>A la diligencia programada deberá de concurrir con un abogado de su libre elección, debiendo comparecer en la hora y fecha que a continuación se detalla:</w:t>
+      </w:r>
+    </w:p>
+    <w:p>
+      <w:pPr>
+        <w:spacing w:after="120"/>
+        <w:rPr>
+          <w:rFonts w:ascii="Arial" w:hAnsi="Arial" w:cs="Arial"/>
+          <w:sz w:val="24"/>
+          <w:szCs w:val="24"/>
+        </w:rPr>
+      </w:pPr>
       <w:r>
         <w:rPr>
           <w:rFonts w:ascii="Arial" w:hAnsi="Arial" w:cs="Arial"/>
@@ -337,16 +285,26 @@
           <w:sz w:val="24"/>
           <w:szCs w:val="24"/>
         </w:rPr>
-        <w:t>{imputados}</w:t>
-      </w:r>
-      <w:r>
-        <w:rPr>
-          <w:rFonts w:ascii="Arial" w:hAnsi="Arial" w:cs="Arial"/>
-          <w:sz w:val="24"/>
-          <w:szCs w:val="24"/>
-        </w:rPr>
-        <w:t xml:space="preserve">, en agravio de </w:t>
-      </w:r>
+        <w:t>1ra. Citación:</w:t>
+      </w:r>
+      <w:r>
+        <w:rPr>
+          <w:rFonts w:ascii="Arial" w:hAnsi="Arial" w:cs="Arial"/>
+          <w:sz w:val="24"/>
+          <w:szCs w:val="24"/>
+        </w:rPr>
+        <w:t>{citacion1}</w:t>
+      </w:r>
+    </w:p>
+    <w:p>
+      <w:pPr>
+        <w:spacing w:after="120"/>
+        <w:rPr>
+          <w:rFonts w:ascii="Arial" w:hAnsi="Arial" w:cs="Arial"/>
+          <w:sz w:val="24"/>
+          <w:szCs w:val="24"/>
+        </w:rPr>
+      </w:pPr>
       <w:r>
         <w:rPr>
           <w:rFonts w:ascii="Arial" w:hAnsi="Arial" w:cs="Arial"/>
@@ -355,33 +313,15 @@
           <w:sz w:val="24"/>
           <w:szCs w:val="24"/>
         </w:rPr>
-        <w:t>{agraviado}</w:t>
-      </w:r>
-      <w:r>
-        <w:rPr>
-          <w:rFonts w:ascii="Arial" w:hAnsi="Arial" w:cs="Arial"/>
-          <w:sz w:val="24"/>
-          <w:szCs w:val="24"/>
-        </w:rPr>
-        <w:t>.</w:t>
-      </w:r>
-    </w:p>
-    <w:p>
-      <w:pPr>
-        <w:spacing w:after="120"/>
-        <w:rPr>
-          <w:rFonts w:ascii="Arial" w:hAnsi="Arial" w:cs="Arial"/>
-          <w:sz w:val="24"/>
-          <w:szCs w:val="24"/>
-        </w:rPr>
-      </w:pPr>
-      <w:r>
-        <w:rPr>
-          <w:rFonts w:ascii="Arial" w:hAnsi="Arial" w:cs="Arial"/>
-          <w:sz w:val="24"/>
-          <w:szCs w:val="24"/>
-        </w:rPr>
-        <w:t>A la diligencia programada deberá de concurrir con un abogado de su libre elección, debiendo comparecer en la hora y fecha que a continuación se detalla:</w:t>
+        <w:t>2da. Citación:</w:t>
+      </w:r>
+      <w:r>
+        <w:rPr>
+          <w:rFonts w:ascii="Arial" w:hAnsi="Arial" w:cs="Arial"/>
+          <w:sz w:val="24"/>
+          <w:szCs w:val="24"/>
+        </w:rPr>
+        <w:t>{citacion2}</w:t>
       </w:r>
     </w:p>
     <w:p>
@@ -401,63 +341,7 @@
           <w:sz w:val="24"/>
           <w:szCs w:val="24"/>
         </w:rPr>
-        <w:t>1ra. Citación: </w:t>
-      </w:r>
-      <w:r>
-        <w:rPr>
-          <w:rFonts w:ascii="Arial" w:hAnsi="Arial" w:cs="Arial"/>
-          <w:sz w:val="24"/>
-          <w:szCs w:val="24"/>
-        </w:rPr>
-        <w:t>{citacion1}</w:t>
-      </w:r>
-    </w:p>
-    <w:p>
-      <w:pPr>
-        <w:spacing w:after="120"/>
-        <w:rPr>
-          <w:rFonts w:ascii="Arial" w:hAnsi="Arial" w:cs="Arial"/>
-          <w:sz w:val="24"/>
-          <w:szCs w:val="24"/>
-        </w:rPr>
-      </w:pPr>
-      <w:r>
-        <w:rPr>
-          <w:rFonts w:ascii="Arial" w:hAnsi="Arial" w:cs="Arial"/>
-          <w:b/>
-          <w:bCs/>
-          <w:sz w:val="24"/>
-          <w:szCs w:val="24"/>
-        </w:rPr>
-        <w:t>2da. Citación: </w:t>
-      </w:r>
-      <w:r>
-        <w:rPr>
-          <w:rFonts w:ascii="Arial" w:hAnsi="Arial" w:cs="Arial"/>
-          <w:sz w:val="24"/>
-          <w:szCs w:val="24"/>
-        </w:rPr>
-        <w:t>{citacion2}</w:t>
-      </w:r>
-    </w:p>
-    <w:p>
-      <w:pPr>
-        <w:spacing w:after="120"/>
-        <w:rPr>
-          <w:rFonts w:ascii="Arial" w:hAnsi="Arial" w:cs="Arial"/>
-          <w:sz w:val="24"/>
-          <w:szCs w:val="24"/>
-        </w:rPr>
-      </w:pPr>
-      <w:r>
-        <w:rPr>
-          <w:rFonts w:ascii="Arial" w:hAnsi="Arial" w:cs="Arial"/>
-          <w:b/>
-          <w:bCs/>
-          <w:sz w:val="24"/>
-          <w:szCs w:val="24"/>
-        </w:rPr>
-        <w:t>3ra. Citación: </w:t>
+        <w:t>3ra. Citación:</w:t>
       </w:r>
       <w:r>
         <w:rPr>
@@ -935,17 +819,6 @@
         </w:rPr>
         <w:t>:</w:t>
       </w:r>
-    </w:p>
-    <w:p>
-      <w:pPr>
-        <w:spacing w:after="100"/>
-        <w:jc w:val="center"/>
-        <w:rPr>
-          <w:rFonts w:ascii="Arial" w:hAnsi="Arial" w:cs="Arial"/>
-          <w:sz w:val="24"/>
-          <w:szCs w:val="24"/>
-        </w:rPr>
-      </w:pPr>
     </w:p>
     <w:sectPr>
       <w:headerReference w:type="default" r:id="rId10"/>

</xml_diff>